<commit_message>
Reestrutura proposta de escopo: adiciona abertura sobre transparência de vendas, remove travessões e ajusta linguagem
Co-Authored-By: Claude Sonnet 5 <noreply@anthropic.com>
Claude-Session: https://claude.ai/code/session_01GQSqEjEuqv44iBdACeUWUZ
</commit_message>
<xml_diff>
--- a/eleva/proposta-atualizacao-escopo-investimento.docx
+++ b/eleva/proposta-atualizacao-escopo-investimento.docx
@@ -61,6 +61,51 @@
           <w:szCs w:val="21"/>
         </w:rPr>
         <w:t xml:space="preserve"> Giuliano Spolavori</w:t>
+      </w:r>
+    </w:p>
+    <w:p>
+      <w:pPr>
+        <w:pStyle w:val="Heading2"/>
+        <w:spacing w:after="150" w:before="300"/>
+      </w:pPr>
+      <w:r>
+        <w:t xml:space="preserve">Um projeto em que acredito, com transparência sobre onde estamos</w:t>
+      </w:r>
+    </w:p>
+    <w:p>
+      <w:pPr>
+        <w:spacing w:after="160"/>
+      </w:pPr>
+      <w:r>
+        <w:rPr>
+          <w:sz w:val="21"/>
+          <w:szCs w:val="21"/>
+        </w:rPr>
+        <w:t xml:space="preserve">Giu, antes de entrar nos números, quero te dizer que essa parceria significa muito para mim, desde abril, quando começamos, até hoje. A confiança que você depositou na Recria, incluindo as indicações para a Strategia e, mais recentemente, para o projeto da Patrícia, é algo que eu valorizo de verdade e não trato como certo.</w:t>
+      </w:r>
+    </w:p>
+    <w:p>
+      <w:pPr>
+        <w:spacing w:after="160"/>
+      </w:pPr>
+      <w:r>
+        <w:rPr>
+          <w:sz w:val="21"/>
+          <w:szCs w:val="21"/>
+        </w:rPr>
+        <w:t xml:space="preserve">Tem um ponto sensível que preciso comentar antes de seguir, mesmo sabendo que não é responsabilidade minha, mas é importante estar claro entre a gente. Até o momento, ainda não tivemos venda de diagnóstico nem de mentoria, que são os produtos de maior valor agregado. Tivemos vendas do curso de fornecedor e do curso de síndico, e em alguns momentos nem tivemos retorno do investimento em tráfego pago. Sei que ainda estamos engatinhando nesse processo, também porque decidimos juntos dar um passo atrás, primeiro crescer a autoridade do Giu, para depois conseguir vender diagnóstico e mentoria sem precisar de um investimento tão grande em tráfego, seja no Google ou na Meta.</w:t>
+      </w:r>
+    </w:p>
+    <w:p>
+      <w:pPr>
+        <w:spacing w:after="160"/>
+      </w:pPr>
+      <w:r>
+        <w:rPr>
+          <w:sz w:val="21"/>
+          <w:szCs w:val="21"/>
+        </w:rPr>
+        <w:t xml:space="preserve">Entendo que o projeto ainda não se paga, e estou totalmente comprometida em fazer isso dar certo, para que a nossa parceria perdure e a Eleva consiga prosperar em todas as frentes, todo mundo crescendo junto. Ao mesmo tempo, não posso absorver demandas novas sem ajustar o escopo, porque isso seria injusto com o meu tempo, a minha dedicação e a minha expertise como profissional. É com esse equilíbrio em mente, entre valorizar a nossa parceria e valorizar o meu trabalho, que te trago a proposta abaixo.</w:t>
       </w:r>
     </w:p>
     <w:p>
@@ -145,7 +190,7 @@
           <w:sz w:val="21"/>
           <w:szCs w:val="21"/>
         </w:rPr>
-        <w:t xml:space="preserve"> pras bases de síndico e fornecedor</w:t>
+        <w:t xml:space="preserve"> para as bases de síndico e fornecedor</w:t>
       </w:r>
     </w:p>
     <w:p>
@@ -171,19 +216,19 @@
           <w:sz w:val="21"/>
           <w:szCs w:val="21"/>
         </w:rPr>
-        <w:t xml:space="preserve">, como a criação de panfletos e outros materiais fora do escopo original</w:t>
-      </w:r>
-    </w:p>
-    <w:p>
-      <w:pPr>
-        <w:spacing w:after="160"/>
-      </w:pPr>
-      <w:r>
-        <w:rPr>
-          <w:sz w:val="21"/>
-          <w:szCs w:val="21"/>
-        </w:rPr>
-        <w:t xml:space="preserve">Não cobrei por essas entregas até aqui porque entendi que faziam parte de construir uma estrutura maior, que gera retorno de verdade pra Eleva — e porque acredito na parceria que a gente vem construindo, reforçada pela confiança de você e da Patrícia ao indicarem a Recria pra Strategia e outros projetos. Essa confiança vale muito, e é exatamente por valorizá-la que trago esse assunto com transparência agora, antes de qualquer mudança de escopo, em vez de deixar pra discutir depois que o volume de trabalho já tiver aumentado.</w:t>
+        <w:t xml:space="preserve">, como a criação de panfletos e orçamentos com empresas em nome da Eleva, fora do escopo original</w:t>
+      </w:r>
+    </w:p>
+    <w:p>
+      <w:pPr>
+        <w:spacing w:after="160"/>
+      </w:pPr>
+      <w:r>
+        <w:rPr>
+          <w:sz w:val="21"/>
+          <w:szCs w:val="21"/>
+        </w:rPr>
+        <w:t xml:space="preserve">Não cobrei por essas entregas até aqui porque entendi que faziam parte de construir uma estrutura maior, que gera retorno de verdade para a Eleva. É exatamente por valorizar essa parceria que trago esse assunto com transparência agora, antes de qualquer mudança de escopo, em vez de deixar para discutir depois que o volume de trabalho já tiver aumentado.</w:t>
       </w:r>
     </w:p>
     <w:p>
@@ -204,7 +249,7 @@
           <w:sz w:val="21"/>
           <w:szCs w:val="21"/>
         </w:rPr>
-        <w:t xml:space="preserve">Com a Eleva virando um hub único — reunindo a </w:t>
+        <w:t xml:space="preserve">Com a Eleva virando um hub único, reunindo a </w:t>
       </w:r>
       <w:r>
         <w:rPr>
@@ -252,19 +297,40 @@
           <w:sz w:val="21"/>
           <w:szCs w:val="21"/>
         </w:rPr>
-        <w:t xml:space="preserve"> num mesmo guarda-chuva — todas as frentes vão operar no mesmo Instagram, na mesma BM da Meta e no mesmo gerenciador do Google. É uma evolução ótima pra marca, e quero muito seguir fazendo parte dela.</w:t>
-      </w:r>
-    </w:p>
-    <w:p>
-      <w:pPr>
-        <w:spacing w:after="160"/>
-      </w:pPr>
-      <w:r>
-        <w:rPr>
-          <w:sz w:val="21"/>
-          <w:szCs w:val="21"/>
-        </w:rPr>
-        <w:t xml:space="preserve">A questão que preciso alinhar com você não é "vou cobrar mais porque a empresa cresceu". É mais simples que isso: </w:t>
+        <w:t xml:space="preserve"> num mesmo guarda-chuva, todas as frentes vão operar no mesmo Instagram, na mesma BM da Meta e no mesmo gerenciador do Google. É uma evolução ótima para a marca, e quero muito seguir fazendo parte dela.</w:t>
+      </w:r>
+    </w:p>
+    <w:p>
+      <w:pPr>
+        <w:spacing w:after="160"/>
+      </w:pPr>
+      <w:r>
+        <w:rPr>
+          <w:sz w:val="21"/>
+          <w:szCs w:val="21"/>
+        </w:rPr>
+        <w:t xml:space="preserve">A questão que preciso alinhar com você não é "vou cobrar mais porque a empresa cresceu". É mais simples que isso, cada frente nova, se vier com campanha de tráfego própria e demanda de conteúdo própria, é trabalho real a mais, estudo de público, configuração, criação, curadoria. Meu compromisso é continuar entregando para a Expansão Estratégica, para o Hub de Negócios e para Seguros com a mesma qualidade que você já conhece, sem que isso vire uma cobrança picada por demanda pontual. Por isso cheguei em dois cenários, e gostaria de entender qual dos dois faz mais sentido para você.</w:t>
+      </w:r>
+    </w:p>
+    <w:p>
+      <w:pPr>
+        <w:pStyle w:val="Heading2"/>
+        <w:spacing w:after="150" w:before="300"/>
+      </w:pPr>
+      <w:r>
+        <w:t xml:space="preserve">Cenário 1: sem aumento de demanda</w:t>
+      </w:r>
+    </w:p>
+    <w:p>
+      <w:pPr>
+        <w:spacing w:after="160"/>
+      </w:pPr>
+      <w:r>
+        <w:rPr>
+          <w:sz w:val="21"/>
+          <w:szCs w:val="21"/>
+        </w:rPr>
+        <w:t xml:space="preserve">Continua </w:t>
       </w:r>
       <w:r>
         <w:rPr>
@@ -273,14 +339,26 @@
           <w:sz w:val="21"/>
           <w:szCs w:val="21"/>
         </w:rPr>
-        <w:t xml:space="preserve">cada frente nova, se vier com campanha de tráfego própria e demanda de conteúdo própria, é trabalho real a mais</w:t>
-      </w:r>
-      <w:r>
-        <w:rPr>
-          <w:sz w:val="21"/>
-          <w:szCs w:val="21"/>
-        </w:rPr>
-        <w:t xml:space="preserve"> — estudo de público, configuração, criação, curadoria. Meu compromisso é continuar entregando pra Expansão Estratégica, pro Hub de Negócios e pra Seguros com a mesma qualidade que você já conhece, sem que isso vire uma cobrança picada por demanda pontual. Por isso cheguei em dois cenários, e quero que a decisão de qual seguir seja sua.</w:t>
+        <w:t xml:space="preserve">R$2.000/mês</w:t>
+      </w:r>
+      <w:r>
+        <w:rPr>
+          <w:sz w:val="21"/>
+          <w:szCs w:val="21"/>
+        </w:rPr>
+        <w:t xml:space="preserve">, sem mudança.</w:t>
+      </w:r>
+    </w:p>
+    <w:p>
+      <w:pPr>
+        <w:spacing w:after="160"/>
+      </w:pPr>
+      <w:r>
+        <w:rPr>
+          <w:sz w:val="21"/>
+          <w:szCs w:val="21"/>
+        </w:rPr>
+        <w:t xml:space="preserve">Os conteúdos da Eleva Seguros e da Eleva Hub de Negócios entram intercalados com os da Expansão Estratégica, dentro do mesmo ritmo de postagem que já temos hoje, sem aumentar volume de carrossel e postagens nas redes sociais, programação dos cortes, e-mail ou alimentação do grupo do WhatsApp. As campanhas de tráfego pago seguem como estão, focadas na Expansão Estratégica, sem estrutura nova.</w:t>
       </w:r>
     </w:p>
     <w:p>
@@ -289,19 +367,19 @@
         <w:spacing w:after="150" w:before="300"/>
       </w:pPr>
       <w:r>
-        <w:t xml:space="preserve">Cenário 1 — sem aumento de demanda</w:t>
-      </w:r>
-    </w:p>
-    <w:p>
-      <w:pPr>
-        <w:spacing w:after="160"/>
-      </w:pPr>
-      <w:r>
-        <w:rPr>
-          <w:sz w:val="21"/>
-          <w:szCs w:val="21"/>
-        </w:rPr>
-        <w:t xml:space="preserve">Continua </w:t>
+        <w:t xml:space="preserve">Cenário 2: com estrutura nova de tráfego e demanda extra para as frentes novas</w:t>
+      </w:r>
+    </w:p>
+    <w:p>
+      <w:pPr>
+        <w:spacing w:after="160"/>
+      </w:pPr>
+      <w:r>
+        <w:rPr>
+          <w:sz w:val="21"/>
+          <w:szCs w:val="21"/>
+        </w:rPr>
+        <w:t xml:space="preserve">Passa para </w:t>
       </w:r>
       <w:r>
         <w:rPr>
@@ -310,71 +388,6 @@
           <w:sz w:val="21"/>
           <w:szCs w:val="21"/>
         </w:rPr>
-        <w:t xml:space="preserve">R$2.000/mês</w:t>
-      </w:r>
-      <w:r>
-        <w:rPr>
-          <w:sz w:val="21"/>
-          <w:szCs w:val="21"/>
-        </w:rPr>
-        <w:t xml:space="preserve">, sem mudança.</w:t>
-      </w:r>
-    </w:p>
-    <w:p>
-      <w:pPr>
-        <w:spacing w:after="160"/>
-      </w:pPr>
-      <w:r>
-        <w:rPr>
-          <w:sz w:val="21"/>
-          <w:szCs w:val="21"/>
-        </w:rPr>
-        <w:t xml:space="preserve">Os conteúdos da Eleva Seguros e do Eleva Hub de Negócios entram </w:t>
-      </w:r>
-      <w:r>
-        <w:rPr>
-          <w:b/>
-          <w:bCs/>
-          <w:sz w:val="21"/>
-          <w:szCs w:val="21"/>
-        </w:rPr>
-        <w:t xml:space="preserve">intercalados</w:t>
-      </w:r>
-      <w:r>
-        <w:rPr>
-          <w:sz w:val="21"/>
-          <w:szCs w:val="21"/>
-        </w:rPr>
-        <w:t xml:space="preserve"> com os da Expansão Estratégica, dentro do mesmo ritmo de postagem que já temos hoje — sem aumentar volume de carrossel e postagens nas redes sociais, programação dos cortes, e-mail ou alimentação do grupo do WhatsApp. As campanhas de tráfego pago seguem como estão, focadas na Expansão Estratégica, sem estrutura nova.</w:t>
-      </w:r>
-    </w:p>
-    <w:p>
-      <w:pPr>
-        <w:pStyle w:val="Heading2"/>
-        <w:spacing w:after="150" w:before="300"/>
-      </w:pPr>
-      <w:r>
-        <w:t xml:space="preserve">Cenário 2 — com estrutura nova de tráfego e demanda extra pras frentes novas</w:t>
-      </w:r>
-    </w:p>
-    <w:p>
-      <w:pPr>
-        <w:spacing w:after="160"/>
-      </w:pPr>
-      <w:r>
-        <w:rPr>
-          <w:sz w:val="21"/>
-          <w:szCs w:val="21"/>
-        </w:rPr>
-        <w:t xml:space="preserve">Passa para </w:t>
-      </w:r>
-      <w:r>
-        <w:rPr>
-          <w:b/>
-          <w:bCs/>
-          <w:sz w:val="21"/>
-          <w:szCs w:val="21"/>
-        </w:rPr>
         <w:t xml:space="preserve">R$3.000/mês</w:t>
       </w:r>
       <w:r>
@@ -394,63 +407,31 @@
           <w:sz w:val="21"/>
           <w:szCs w:val="21"/>
         </w:rPr>
-        <w:t xml:space="preserve">Esse cenário engloba </w:t>
-      </w:r>
-      <w:r>
-        <w:rPr>
-          <w:b/>
-          <w:bCs/>
-          <w:sz w:val="21"/>
-          <w:szCs w:val="21"/>
-        </w:rPr>
-        <w:t xml:space="preserve">configurações e campanhas novas pras duas frentes novas</w:t>
-      </w:r>
-      <w:r>
-        <w:rPr>
-          <w:sz w:val="21"/>
-          <w:szCs w:val="21"/>
-        </w:rPr>
-        <w:t xml:space="preserve"> (Seguros e Hub de Negócios), e </w:t>
-      </w:r>
-      <w:r>
-        <w:rPr>
-          <w:b/>
-          <w:bCs/>
-          <w:sz w:val="21"/>
-          <w:szCs w:val="21"/>
-        </w:rPr>
-        <w:t xml:space="preserve">demandas extras de conteúdo, e-mail ou WhatsApp</w:t>
-      </w:r>
-      <w:r>
-        <w:rPr>
-          <w:sz w:val="21"/>
-          <w:szCs w:val="21"/>
-        </w:rPr>
-        <w:t xml:space="preserve"> que vierem especificamente delas.</w:t>
-      </w:r>
-    </w:p>
-    <w:p>
-      <w:pPr>
-        <w:spacing w:after="160"/>
-      </w:pPr>
-      <w:r>
-        <w:rPr>
-          <w:sz w:val="21"/>
-          <w:szCs w:val="21"/>
-        </w:rPr>
-        <w:t xml:space="preserve">Em tráfego: mesmo que a mudança de público e objetivo entre as frentes seja pequena, campanha nova em Meta e Google significa estudo, configuração e subida do zero pra cada uma — não dá pra rodar tudo numa campanha só. Esse valor de R$500 a mais por frente (R$1.000 no total pras duas) já cobre também qualquer demanda nova de conteúdo, e-mail e alimentação do Hub Eleva no WhatsApp que vier dessas frentes — um valor fechado, sem cobrança avulsa por entrega, que garante a mesma qualidade de ponta a ponta nas três frentes.</w:t>
-      </w:r>
-    </w:p>
-    <w:p>
-      <w:pPr>
-        <w:spacing w:after="160"/>
-      </w:pPr>
-      <w:r>
-        <w:rPr>
-          <w:sz w:val="21"/>
-          <w:szCs w:val="21"/>
-        </w:rPr>
-        <w:t xml:space="preserve">Vale registrar: o valor combinado antes, só pra Eleva Seguros sozinha, já era R$1.000. Se fosse cobrar R$1.000 por frente nova agora (Seguros + Hub), o valor justo seria R$2.000 a mais — R$4.000 no total. Reduzi pra R$500 por frente, um desconto de R$1.000 desde já, exatamente pela parceria construída até aqui, e pelo valor das indicações que recebi de você e da Patrícia. Foi o meio-termo que encontrei pra ser justo dos dois lados.</w:t>
+        <w:t xml:space="preserve">Esse cenário engloba configurações e campanhas novas para as duas frentes novas (Seguros e Hub de Negócios), e demandas extras de conteúdo, e-mail ou WhatsApp que vierem especificamente delas.</w:t>
+      </w:r>
+    </w:p>
+    <w:p>
+      <w:pPr>
+        <w:spacing w:after="160"/>
+      </w:pPr>
+      <w:r>
+        <w:rPr>
+          <w:sz w:val="21"/>
+          <w:szCs w:val="21"/>
+        </w:rPr>
+        <w:t xml:space="preserve">Em tráfego, mesmo que a mudança de público e objetivo entre as frentes seja pequena, campanha nova em Meta e Google significa estudo, configuração e subida do zero para cada uma, não dá para rodar tudo numa campanha só. Esse valor de R$500 a mais por frente (R$1.000 no total para as duas) já cobre também qualquer demanda nova de conteúdo, e-mail e alimentação do Hub Eleva no WhatsApp que vier dessas frentes, um valor fechado, sem cobrança avulsa por entrega, que garante a mesma qualidade de ponta a ponta nas três frentes.</w:t>
+      </w:r>
+    </w:p>
+    <w:p>
+      <w:pPr>
+        <w:spacing w:after="160"/>
+      </w:pPr>
+      <w:r>
+        <w:rPr>
+          <w:sz w:val="21"/>
+          <w:szCs w:val="21"/>
+        </w:rPr>
+        <w:t xml:space="preserve">Vale registrar, o valor combinado antes, só para Eleva Seguros sozinha, já era R$1.000. Se fosse cobrar R$1.000 por frente nova agora (Seguros + Hub), o valor justo seria R$2.000 a mais, R$4.000 no total. Reduzi para R$500 por frente, um desconto de R$1.000 desde já, exatamente pela parceria construída até aqui, e pelo valor das indicações da Strategia e recentemente do projeto da Patrícia. Foi o meio-termo que encontrei para ser justo dos dois lados.</w:t>
       </w:r>
     </w:p>
     <w:p>
@@ -678,7 +659,7 @@
                 <w:sz w:val="19"/>
                 <w:szCs w:val="19"/>
               </w:rPr>
-              <w:t xml:space="preserve">Campanha nova e dedicada pra Seguros e Hub de Negócios</w:t>
+              <w:t xml:space="preserve">Campanha nova e dedicada para Seguros e Hub de Negócios</w:t>
             </w:r>
           </w:p>
         </w:tc>
@@ -818,7 +799,7 @@
                 <w:sz w:val="19"/>
                 <w:szCs w:val="19"/>
               </w:rPr>
-              <w:t xml:space="preserve">Pode aumentar pra Seguros e Hub, sem cobrança avulsa</w:t>
+              <w:t xml:space="preserve">Pode aumentar para Seguros e Hub, sem cobrança avulsa</w:t>
             </w:r>
           </w:p>
         </w:tc>
@@ -917,7 +898,7 @@
                 <w:sz w:val="19"/>
                 <w:szCs w:val="19"/>
               </w:rPr>
-              <w:t xml:space="preserve"> (ex: panfletos)</w:t>
+              <w:t xml:space="preserve"> (ex: panfletos, orçamentos)</w:t>
             </w:r>
           </w:p>
         </w:tc>
@@ -997,19 +978,19 @@
           <w:sz w:val="21"/>
           <w:szCs w:val="21"/>
         </w:rPr>
-        <w:t xml:space="preserve">Se o Cenário 1 for o suficiente por enquanto, sigo com o mesmo valor, sem problema nenhum. Meu único objetivo aqui é manter a relação transparente que a gente construiu desde o início, e garantir que eu continue entregando com a qualidade que a Eleva merece em todas as frentes — sem que isso dependa de eu absorver, silenciosamente, cada vez mais trabalho pelo mesmo valor.</w:t>
-      </w:r>
-    </w:p>
-    <w:p>
-      <w:pPr>
-        <w:spacing w:after="160"/>
-      </w:pPr>
-      <w:r>
-        <w:rPr>
-          <w:sz w:val="21"/>
-          <w:szCs w:val="21"/>
-        </w:rPr>
-        <w:t xml:space="preserve">Obrigada pela confiança de sempre, Giu.</w:t>
+        <w:t xml:space="preserve">Se o Cenário 1 for o suficiente por enquanto, sigo com o mesmo valor, sem problema nenhum. Meu único objetivo aqui é manter a relação transparente que a gente construiu desde o início, e garantir que eu continue entregando com a qualidade que a Eleva merece em todas as frentes.</w:t>
+      </w:r>
+    </w:p>
+    <w:p>
+      <w:pPr>
+        <w:spacing w:after="160"/>
+      </w:pPr>
+      <w:r>
+        <w:rPr>
+          <w:sz w:val="21"/>
+          <w:szCs w:val="21"/>
+        </w:rPr>
+        <w:t xml:space="preserve">Giu, obrigada pela confiança de sempre e fico no aguardo do seu retorno!</w:t>
       </w:r>
     </w:p>
     <w:sectPr>

</xml_diff>

<commit_message>
Ajusta texto da abertura, escopo original e fechamento; mantém tabela comparativa sem quebra de página no PDF
Co-Authored-By: Claude Sonnet 5 <noreply@anthropic.com>
Claude-Session: https://claude.ai/code/session_01GQSqEjEuqv44iBdACeUWUZ
</commit_message>
<xml_diff>
--- a/eleva/proposta-atualizacao-escopo-investimento.docx
+++ b/eleva/proposta-atualizacao-escopo-investimento.docx
@@ -81,19 +81,19 @@
           <w:sz w:val="21"/>
           <w:szCs w:val="21"/>
         </w:rPr>
-        <w:t xml:space="preserve">Giu, antes de entrar nos números, quero te dizer que essa parceria significa muito para mim, desde abril, quando começamos, até hoje. A confiança que você depositou na Recria, incluindo as indicações para a Strategia e, mais recentemente, para o projeto da Patrícia, é algo que eu valorizo de verdade e não trato como certo.</w:t>
-      </w:r>
-    </w:p>
-    <w:p>
-      <w:pPr>
-        <w:spacing w:after="160"/>
-      </w:pPr>
-      <w:r>
-        <w:rPr>
-          <w:sz w:val="21"/>
-          <w:szCs w:val="21"/>
-        </w:rPr>
-        <w:t xml:space="preserve">Tem um ponto sensível que preciso comentar antes de seguir, mesmo sabendo que não é responsabilidade minha, mas é importante estar claro entre a gente. Até o momento, ainda não tivemos venda de diagnóstico nem de mentoria, que são os produtos de maior valor agregado. Tivemos vendas do curso de fornecedor e do curso de síndico, e em alguns momentos nem tivemos retorno do investimento em tráfego pago. Sei que ainda estamos engatinhando nesse processo, também porque decidimos juntos dar um passo atrás, primeiro crescer a autoridade do Giu, para depois conseguir vender diagnóstico e mentoria sem precisar de um investimento tão grande em tráfego, seja no Google ou na Meta.</w:t>
+        <w:t xml:space="preserve">Giu, antes de entrar nos números, quero te dizer que essa parceria significa muito para mim, desde abril, quando começamos, até hoje. A confiança que você depositou em mim, incluindo as indicações para a Strategia e, mais recentemente, para o projeto da Patrícia, é algo que eu valorizo de verdade.</w:t>
+      </w:r>
+    </w:p>
+    <w:p>
+      <w:pPr>
+        <w:spacing w:after="160"/>
+      </w:pPr>
+      <w:r>
+        <w:rPr>
+          <w:sz w:val="21"/>
+          <w:szCs w:val="21"/>
+        </w:rPr>
+        <w:t xml:space="preserve">Tem um ponto sensível que preciso comentar antes de seguir, até o momento, ainda não tivemos venda de diagnóstico nem de mentoria, que são os produtos de maior valor agregado. Tivemos vendas do curso de fornecedor e do curso de síndico, e em alguns momentos nem tivemos retorno do investimento em tráfego pago. Sei que ainda estamos engatinhando nesse processo, também porque decidimos juntos dar um passo atrás, primeiro crescer a sua autoridade a nível estadual e nacional, para depois conseguirmos vender diagnóstico e mentoria sem precisar de um investimento tão grande em tráfego, seja no Google ou na Meta.</w:t>
       </w:r>
     </w:p>
     <w:p>
@@ -126,7 +126,7 @@
           <w:sz w:val="21"/>
           <w:szCs w:val="21"/>
         </w:rPr>
-        <w:t xml:space="preserve">Desde abril, quando a Recria assumiu a gestão de marketing da Eleva, o escopo original combinado foi direto: cuidar das redes sociais (Instagram e LinkedIn) e do tráfego pago (Meta e Google). Esse era o trato.</w:t>
+        <w:t xml:space="preserve">Desde abril, quando a Recria assumiu a gestão de marketing da Eleva, o escopo original combinado foi: cuidar das redes sociais (Instagram e LinkedIn) e do tráfego pago (Meta e Google).</w:t>
       </w:r>
     </w:p>
     <w:p>
@@ -979,6 +979,18 @@
           <w:szCs w:val="21"/>
         </w:rPr>
         <w:t xml:space="preserve">Se o Cenário 1 for o suficiente por enquanto, sigo com o mesmo valor, sem problema nenhum. Meu único objetivo aqui é manter a relação transparente que a gente construiu desde o início, e garantir que eu continue entregando com a qualidade que a Eleva merece em todas as frentes.</w:t>
+      </w:r>
+    </w:p>
+    <w:p>
+      <w:pPr>
+        <w:spacing w:after="160"/>
+      </w:pPr>
+      <w:r>
+        <w:rPr>
+          <w:sz w:val="21"/>
+          <w:szCs w:val="21"/>
+        </w:rPr>
+        <w:t xml:space="preserve">Se você optar pelo Cenário 2, precisaremos alinhar uma reunião extra para estruturarmos quando essas duas frentes entrariam no escopo, e qual o seu objetivo inicial de cada frente nova, para que assim eu já monte e valide com você as possíveis estratégias em anúncios e conteúdos.</w:t>
       </w:r>
     </w:p>
     <w:p>

</xml_diff>

<commit_message>
Mantém título da tabela comparativa na mesma página da tabela
Co-Authored-By: Claude Sonnet 5 <noreply@anthropic.com>
Claude-Session: https://claude.ai/code/session_01GQSqEjEuqv44iBdACeUWUZ
</commit_message>
<xml_diff>
--- a/eleva/proposta-atualizacao-escopo-investimento.docx
+++ b/eleva/proposta-atualizacao-escopo-investimento.docx
@@ -66,6 +66,7 @@
     <w:p>
       <w:pPr>
         <w:pStyle w:val="Heading2"/>
+        <w:keepNext/>
         <w:spacing w:after="150" w:before="300"/>
       </w:pPr>
       <w:r>
@@ -111,6 +112,7 @@
     <w:p>
       <w:pPr>
         <w:pStyle w:val="Heading2"/>
+        <w:keepNext/>
         <w:spacing w:after="150" w:before="300"/>
       </w:pPr>
       <w:r>
@@ -234,6 +236,7 @@
     <w:p>
       <w:pPr>
         <w:pStyle w:val="Heading2"/>
+        <w:keepNext/>
         <w:spacing w:after="150" w:before="300"/>
       </w:pPr>
       <w:r>
@@ -315,6 +318,7 @@
     <w:p>
       <w:pPr>
         <w:pStyle w:val="Heading2"/>
+        <w:keepNext/>
         <w:spacing w:after="150" w:before="300"/>
       </w:pPr>
       <w:r>
@@ -364,6 +368,7 @@
     <w:p>
       <w:pPr>
         <w:pStyle w:val="Heading2"/>
+        <w:keepNext/>
         <w:spacing w:after="150" w:before="300"/>
       </w:pPr>
       <w:r>
@@ -437,6 +442,7 @@
     <w:p>
       <w:pPr>
         <w:pStyle w:val="Heading2"/>
+        <w:keepNext/>
         <w:spacing w:after="150" w:before="300"/>
       </w:pPr>
       <w:r>
@@ -963,6 +969,7 @@
     <w:p>
       <w:pPr>
         <w:pStyle w:val="Heading2"/>
+        <w:keepNext/>
         <w:spacing w:after="150" w:before="300"/>
       </w:pPr>
       <w:r>

</xml_diff>